<commit_message>
Polish UI and prepare Vercel deployment
</commit_message>
<xml_diff>
--- a/backend/app/data/Brielle Johnston CV EN.docx
+++ b/backend/app/data/Brielle Johnston CV EN.docx
@@ -1129,22 +1129,14 @@
       </w:pPr>
       <w:r>
         <w:rPr>
-          <w:rFonts w:ascii="Calibri" w:cs="Calibri" w:eastAsia="Calibri" w:hAnsi="Calibri"/>
-          <w:b w:val="0"/>
-          <w:bCs w:val="0"/>
-          <w:i w:val="0"/>
-          <w:iCs w:val="0"/>
-          <w:smallCaps w:val="0"/>
-          <w:strike w:val="0"/>
-          <w:color w:val="27303d"/>
-          <w:sz w:val="20"/>
-          <w:szCs w:val="20"/>
-          <w:u w:val="none"/>
-          <w:shd w:fill="auto" w:val="clear"/>
-          <w:vertAlign w:val="baseline"/>
-          <w:rtl w:val="0"/>
-        </w:rPr>
-        <w:t xml:space="preserve">Developed and optimized machine learning and deep learning solutions using ML libraries for classification, regression, and time-series forecasting, applying advanced feature engineering, statistical data preparation, hyperparameter optimization, custom loss functions, and model evaluation techniques.</w:t>
+          <w:rtl w:val="0"/>
+        </w:rPr>
+        <w:t xml:space="preserve">Developed and optimized machine learning and deep learning solutions for classification, regression, and time-series forecasting to predict factory incidents, machinery overloads, and sensor values. Applied advanced feature engineering, statistical preprocessing, hyperparameter tuning, custom loss functions, and model evaluation techniques to improve model performance and reliability.</w:t>
+      </w:r>
+      <w:r>
+        <w:rPr>
+          <w:rtl w:val="0"/>
+        </w:rPr>
       </w:r>
     </w:p>
     <w:p>

</xml_diff>